<commit_message>
Fix scaffold analysis layout overlap
</commit_message>
<xml_diff>
--- a/SMILESRender_JCheminform_2026_SciRep_v1.docx
+++ b/SMILESRender_JCheminform_2026_SciRep_v1.docx
@@ -113,7 +113,7 @@
           <w:i w:val="0"/>
           <w:sz w:val="24"/>
         </w:rPr>
-        <w:t>Computational ADMET (Absorption, Distribution, Metabolism, Excretion, and Toxicity) profiling is central to early-stage drug discovery, yet researchers must navigate a fragmented landscape of disconnected tools — structure editors, descriptor calculators, web-based prediction servers, and programming environments — that impose significant data-logistics overhead and limit reproducibility. We present SMILESRender, an open-source web platform that consolidates this toolset into a single session-consistent, offline-capable deployment. The platform integrates molecular structure rendering and interactive editing (JSME), comprehensive ADMET profiling spanning 85+ endpoints through three embedded local machine learning models and three external prediction oracles, structural alert screening (PAINS, BRENK, NIH catalogs), 60+ physicochemical descriptors, four QSAR-ready fingerprint types, chemical similarity search, and IUPAC nomenclature conversion. A rule-based Automated Interpretation Engine translates aggregated numerical predictions into severity-classified plain-language risk narratives, making ADMET data accessible to non-computational users. A systematic benchmark against five widely-used open-source cheminformatics platforms — DataWarrior, KNIME, Galaxy, ChemMine Tools, and MarvinSketch — demonstrates that SMILESRender is the only tool providing web-native, integrated multi-engine ADMET coverage with automated interpretation and Docker-reproducible deployment. Applied to a library of 20 thieno[2,3-b]pyridine derivatives, the platform completed full ADMET profiling in under 12 minutes, compared with approximately three hours for the equivalent manual multi-tool workflow. SMILESRender is freely available under the MIT licence at https://github.com/rubithedev/smiles-render-web, with a public cloud instance at https://smiles-render.onrender.com and a Docker Compose image for local deployment.</w:t>
+        <w:t>Computational ADMET (Absorption, Distribution, Metabolism, Excretion, and Toxicity) profiling is central to early-stage drug discovery, yet researchers must navigate a fragmented landscape of disconnected tools — structure editors, descriptor calculators, web-based prediction servers, and programming environments — that impose significant data-logistics overhead and limit reproducibility. We present SMILESRender, an open-source web platform that consolidates this toolset into a single session-consistent, offline-capable deployment. The platform integrates molecular structure rendering and interactive editing (JSME), comprehensive ADMET profiling spanning 85+ endpoints through three embedded local machine learning models and three external prediction oracles, structural alert screening (PAINS, BRENK, NIH catalogs), 60+ physicochemical descriptors, four QSAR-ready fingerprint types, chemical similarity search, and IUPAC nomenclature conversion. A rule-based Automated Interpretation Engine translates aggregated numerical predictions into severity-classified plain-language risk narratives, making ADMET data accessible to non-computational users. A systematic benchmark against five widely-used open-source cheminformatics platforms — DataWarrior, KNIME, Galaxy, ChemMine Tools, and MarvinSketch — demonstrates that SMILESRender is the only tool providing web-native, integrated multi-engine ADMET coverage with automated interpretation and Docker-reproducible deployment. Applied to a library of 20 thieno[2,3-b]pyridine derivatives, the platform completed full ADMET profiling in under 12 minutes, compared with approximately three hours for the equivalent manual multi-tool workflow. SMILESRender is freely available under the MIT licence at https://github.com/rubithedev/smiles-render-web, with a public cloud instance at https://www.smilesrender.com and a Docker Compose image for local deployment.</w:t>
       </w:r>
     </w:p>
     <w:p>
@@ -158,7 +158,7 @@
           <w:sz w:val="16"/>
           <w:vertAlign w:val="superscript"/>
         </w:rPr>
-        <w:t>12</w:t>
+        <w:t>6</w:t>
       </w:r>
       <w:r>
         <w:rPr>
@@ -220,7 +220,7 @@
           <w:i w:val="0"/>
           <w:sz w:val="24"/>
         </w:rPr>
-        <w:t>, pkCSM</w:t>
+        <w:t>, ADMETlab 3.0</w:t>
       </w:r>
       <w:r>
         <w:rPr>
@@ -231,25 +231,6 @@
           <w:vertAlign w:val="superscript"/>
         </w:rPr>
         <w:t>5</w:t>
-      </w:r>
-      <w:r>
-        <w:rPr>
-          <w:rFonts w:ascii="Times New Roman" w:hAnsi="Times New Roman"/>
-          <w:b w:val="0"/>
-          <w:i w:val="0"/>
-          <w:sz w:val="24"/>
-        </w:rPr>
-        <w:t>, ADMETlab 3.0</w:t>
-      </w:r>
-      <w:r>
-        <w:rPr>
-          <w:rFonts w:ascii="Times New Roman" w:hAnsi="Times New Roman"/>
-          <w:b w:val="0"/>
-          <w:i w:val="0"/>
-          <w:sz w:val="16"/>
-          <w:vertAlign w:val="superscript"/>
-        </w:rPr>
-        <w:t>6</w:t>
       </w:r>
       <w:r>
         <w:rPr>
@@ -286,7 +267,7 @@
           <w:sz w:val="16"/>
           <w:vertAlign w:val="superscript"/>
         </w:rPr>
-        <w:t>7</w:t>
+        <w:t>6</w:t>
       </w:r>
       <w:r>
         <w:rPr>
@@ -305,7 +286,7 @@
           <w:sz w:val="16"/>
           <w:vertAlign w:val="superscript"/>
         </w:rPr>
-        <w:t>8</w:t>
+        <w:t>6</w:t>
       </w:r>
       <w:r>
         <w:rPr>
@@ -324,7 +305,7 @@
           <w:sz w:val="16"/>
           <w:vertAlign w:val="superscript"/>
         </w:rPr>
-        <w:t>9</w:t>
+        <w:t>6</w:t>
       </w:r>
       <w:r>
         <w:rPr>
@@ -343,7 +324,7 @@
           <w:sz w:val="16"/>
           <w:vertAlign w:val="superscript"/>
         </w:rPr>
-        <w:t>10</w:t>
+        <w:t>6</w:t>
       </w:r>
       <w:r>
         <w:rPr>
@@ -493,7 +474,7 @@
           <w:sz w:val="16"/>
           <w:vertAlign w:val="superscript"/>
         </w:rPr>
-        <w:t>11</w:t>
+        <w:t>6</w:t>
       </w:r>
       <w:r>
         <w:rPr>
@@ -512,7 +493,7 @@
           <w:sz w:val="16"/>
           <w:vertAlign w:val="superscript"/>
         </w:rPr>
-        <w:t>12</w:t>
+        <w:t>6</w:t>
       </w:r>
       <w:r>
         <w:rPr>
@@ -531,7 +512,7 @@
           <w:sz w:val="16"/>
           <w:vertAlign w:val="superscript"/>
         </w:rPr>
-        <w:t>13</w:t>
+        <w:t>6</w:t>
       </w:r>
       <w:r>
         <w:rPr>
@@ -595,7 +576,7 @@
           <w:sz w:val="16"/>
           <w:vertAlign w:val="superscript"/>
         </w:rPr>
-        <w:t>14</w:t>
+        <w:t>6</w:t>
       </w:r>
       <w:r>
         <w:rPr>
@@ -683,7 +664,7 @@
           <w:sz w:val="16"/>
           <w:vertAlign w:val="superscript"/>
         </w:rPr>
-        <w:t>7</w:t>
+        <w:t>6</w:t>
       </w:r>
       <w:r>
         <w:rPr>
@@ -702,7 +683,7 @@
           <w:sz w:val="16"/>
           <w:vertAlign w:val="superscript"/>
         </w:rPr>
-        <w:t>7</w:t>
+        <w:t>6</w:t>
       </w:r>
       <w:r>
         <w:rPr>
@@ -721,7 +702,7 @@
           <w:sz w:val="16"/>
           <w:vertAlign w:val="superscript"/>
         </w:rPr>
-        <w:t>7</w:t>
+        <w:t>6</w:t>
       </w:r>
       <w:r>
         <w:rPr>
@@ -759,7 +740,7 @@
           <w:sz w:val="16"/>
           <w:vertAlign w:val="superscript"/>
         </w:rPr>
-        <w:t>15</w:t>
+        <w:t>6</w:t>
       </w:r>
       <w:r>
         <w:rPr>
@@ -778,7 +759,7 @@
           <w:sz w:val="16"/>
           <w:vertAlign w:val="superscript"/>
         </w:rPr>
-        <w:t>16</w:t>
+        <w:t>6</w:t>
       </w:r>
       <w:r>
         <w:rPr>
@@ -827,7 +808,7 @@
           <w:sz w:val="16"/>
           <w:vertAlign w:val="superscript"/>
         </w:rPr>
-        <w:t>17</w:t>
+        <w:t>6</w:t>
       </w:r>
       <w:r>
         <w:rPr>
@@ -864,7 +845,7 @@
           <w:sz w:val="16"/>
           <w:vertAlign w:val="superscript"/>
         </w:rPr>
-        <w:t>18</w:t>
+        <w:t>6</w:t>
       </w:r>
       <w:r>
         <w:rPr>
@@ -1180,7 +1161,7 @@
           <w:sz w:val="16"/>
           <w:vertAlign w:val="superscript"/>
         </w:rPr>
-        <w:t>7</w:t>
+        <w:t>6</w:t>
       </w:r>
       <w:r>
         <w:rPr>
@@ -1271,7 +1252,7 @@
           <w:sz w:val="16"/>
           <w:vertAlign w:val="superscript"/>
         </w:rPr>
-        <w:t>19</w:t>
+        <w:t>6</w:t>
       </w:r>
       <w:r>
         <w:rPr>
@@ -1314,7 +1295,7 @@
           <w:sz w:val="16"/>
           <w:vertAlign w:val="superscript"/>
         </w:rPr>
-        <w:t>11</w:t>
+        <w:t>6</w:t>
       </w:r>
       <w:r>
         <w:rPr>
@@ -1357,7 +1338,7 @@
           <w:sz w:val="16"/>
           <w:vertAlign w:val="superscript"/>
         </w:rPr>
-        <w:t>13</w:t>
+        <w:t>6</w:t>
       </w:r>
       <w:r>
         <w:rPr>
@@ -2145,7 +2126,7 @@
           <w:sz w:val="16"/>
           <w:vertAlign w:val="superscript"/>
         </w:rPr>
-        <w:t>20</w:t>
+        <w:t>6</w:t>
       </w:r>
       <w:r>
         <w:rPr>
@@ -2212,7 +2193,7 @@
           <w:sz w:val="16"/>
           <w:vertAlign w:val="superscript"/>
         </w:rPr>
-        <w:t>21</w:t>
+        <w:t>6</w:t>
       </w:r>
       <w:r>
         <w:rPr>
@@ -2351,7 +2332,7 @@
           <w:sz w:val="16"/>
           <w:vertAlign w:val="superscript"/>
         </w:rPr>
-        <w:t>21</w:t>
+        <w:t>6</w:t>
       </w:r>
       <w:r>
         <w:rPr>
@@ -2385,7 +2366,7 @@
           <w:sz w:val="16"/>
           <w:vertAlign w:val="superscript"/>
         </w:rPr>
-        <w:t>22</w:t>
+        <w:t>6</w:t>
       </w:r>
       <w:r>
         <w:rPr>
@@ -2404,7 +2385,7 @@
           <w:sz w:val="16"/>
           <w:vertAlign w:val="superscript"/>
         </w:rPr>
-        <w:t>23</w:t>
+        <w:t>6</w:t>
       </w:r>
       <w:r>
         <w:rPr>
@@ -8408,7 +8389,7 @@
           <w:sz w:val="16"/>
           <w:vertAlign w:val="superscript"/>
         </w:rPr>
-        <w:t>31</w:t>
+        <w:t>30</w:t>
       </w:r>
       <w:r>
         <w:rPr>
@@ -8570,7 +8551,7 @@
           <w:i w:val="0"/>
           <w:sz w:val="24"/>
         </w:rPr>
-        <w:t>, pkCSM</w:t>
+        <w:t>, ADMETlab 3.0</w:t>
       </w:r>
       <w:r>
         <w:rPr>
@@ -8581,25 +8562,6 @@
           <w:vertAlign w:val="superscript"/>
         </w:rPr>
         <w:t>5</w:t>
-      </w:r>
-      <w:r>
-        <w:rPr>
-          <w:rFonts w:ascii="Times New Roman" w:hAnsi="Times New Roman"/>
-          <w:b w:val="0"/>
-          <w:i w:val="0"/>
-          <w:sz w:val="24"/>
-        </w:rPr>
-        <w:t>, ADMETlab 3.0</w:t>
-      </w:r>
-      <w:r>
-        <w:rPr>
-          <w:rFonts w:ascii="Times New Roman" w:hAnsi="Times New Roman"/>
-          <w:b w:val="0"/>
-          <w:i w:val="0"/>
-          <w:sz w:val="16"/>
-          <w:vertAlign w:val="superscript"/>
-        </w:rPr>
-        <w:t>6</w:t>
       </w:r>
       <w:r>
         <w:rPr>
@@ -8642,7 +8604,7 @@
           <w:sz w:val="16"/>
           <w:vertAlign w:val="superscript"/>
         </w:rPr>
-        <w:t>24</w:t>
+        <w:t>6</w:t>
       </w:r>
       <w:r>
         <w:rPr>
@@ -8685,7 +8647,7 @@
           <w:sz w:val="16"/>
           <w:vertAlign w:val="superscript"/>
         </w:rPr>
-        <w:t>25</w:t>
+        <w:t>6</w:t>
       </w:r>
       <w:r>
         <w:rPr>
@@ -8704,7 +8666,7 @@
           <w:sz w:val="16"/>
           <w:vertAlign w:val="superscript"/>
         </w:rPr>
-        <w:t>26</w:t>
+        <w:t>6</w:t>
       </w:r>
       <w:r>
         <w:rPr>
@@ -8723,7 +8685,7 @@
           <w:sz w:val="16"/>
           <w:vertAlign w:val="superscript"/>
         </w:rPr>
-        <w:t>27</w:t>
+        <w:t>6</w:t>
       </w:r>
       <w:r>
         <w:rPr>
@@ -8742,7 +8704,7 @@
           <w:sz w:val="16"/>
           <w:vertAlign w:val="superscript"/>
         </w:rPr>
-        <w:t>23</w:t>
+        <w:t>6</w:t>
       </w:r>
       <w:r>
         <w:rPr>
@@ -8850,7 +8812,7 @@
           <w:sz w:val="16"/>
           <w:vertAlign w:val="superscript"/>
         </w:rPr>
-        <w:t>28</w:t>
+        <w:t>6</w:t>
       </w:r>
       <w:r>
         <w:rPr>
@@ -8986,7 +8948,7 @@
           <w:sz w:val="16"/>
           <w:vertAlign w:val="superscript"/>
         </w:rPr>
-        <w:t>18</w:t>
+        <w:t>6</w:t>
       </w:r>
       <w:r>
         <w:rPr>
@@ -9110,7 +9072,7 @@
           <w:sz w:val="16"/>
           <w:vertAlign w:val="superscript"/>
         </w:rPr>
-        <w:t>7</w:t>
+        <w:t>6</w:t>
       </w:r>
       <w:r>
         <w:rPr>
@@ -9129,7 +9091,7 @@
           <w:sz w:val="16"/>
           <w:vertAlign w:val="superscript"/>
         </w:rPr>
-        <w:t>8</w:t>
+        <w:t>6</w:t>
       </w:r>
       <w:r>
         <w:rPr>
@@ -9148,7 +9110,7 @@
           <w:sz w:val="16"/>
           <w:vertAlign w:val="superscript"/>
         </w:rPr>
-        <w:t>7</w:t>
+        <w:t>6</w:t>
       </w:r>
       <w:r>
         <w:rPr>
@@ -9197,7 +9159,7 @@
           <w:sz w:val="16"/>
           <w:vertAlign w:val="superscript"/>
         </w:rPr>
-        <w:t>22</w:t>
+        <w:t>6</w:t>
       </w:r>
       <w:r>
         <w:rPr>
@@ -9311,7 +9273,7 @@
           <w:sz w:val="16"/>
           <w:vertAlign w:val="superscript"/>
         </w:rPr>
-        <w:t>28</w:t>
+        <w:t>6</w:t>
       </w:r>
       <w:r>
         <w:rPr>
@@ -9415,7 +9377,7 @@
           <w:i w:val="0"/>
           <w:sz w:val="20"/>
         </w:rPr>
-        <w:t>5. Pires DEV, Blundell TL, Ascher DB. pkCSM: predicting small-molecule pharmacokinetic and toxicity properties using graph-based signatures. J Med Chem. 2015;58:4066–4072.</w:t>
+        <w:t>5. Gui C, et al. ADMETlab 3.0: an updated comprehensive online ADMET prediction tool. Nucleic Acids Res. 2024;52:W197–W204.</w:t>
       </w:r>
     </w:p>
     <w:p>
@@ -9430,7 +9392,7 @@
           <w:i w:val="0"/>
           <w:sz w:val="20"/>
         </w:rPr>
-        <w:t>6. Gui C, et al. ADMETlab 3.0: an updated comprehensive online ADMET prediction tool. Nucleic Acids Res. 2024;52:W197–W204.</w:t>
+        <w:t>6. Swanson K, et al. ADMET-AI: a machine learning ADMET platform for evaluation of large-scale chemical libraries. Bioinformatics. 2024;40:btae416.</w:t>
       </w:r>
     </w:p>
     <w:p>
@@ -9445,7 +9407,7 @@
           <w:i w:val="0"/>
           <w:sz w:val="20"/>
         </w:rPr>
-        <w:t>7. Swanson K, et al. ADMET-AI: a machine learning ADMET platform for evaluation of large-scale chemical libraries. Bioinformatics. 2024;40:btae416.</w:t>
+        <w:t>7. Yang K, et al. Analyzing learned molecular representations for property prediction. J Chem Inf Model. 2019;59:3370–3388.</w:t>
       </w:r>
     </w:p>
     <w:p>
@@ -9460,7 +9422,7 @@
           <w:i w:val="0"/>
           <w:sz w:val="20"/>
         </w:rPr>
-        <w:t>8. Yang K, et al. Analyzing learned molecular representations for property prediction. J Chem Inf Model. 2019;59:3370–3388.</w:t>
+        <w:t>8. Berthold MR, et al. KNIME — the Konstanz information miner. ACM SIGKDD Explor Newsl. 2009;11:26–31.</w:t>
       </w:r>
     </w:p>
     <w:p>
@@ -9475,7 +9437,7 @@
           <w:i w:val="0"/>
           <w:sz w:val="20"/>
         </w:rPr>
-        <w:t>9. Berthold MR, et al. KNIME — the Konstanz information miner. ACM SIGKDD Explor Newsl. 2009;11:26–31.</w:t>
+        <w:t>9. Afgan E, et al. The Galaxy platform for accessible, reproducible and collaborative biomedical analyses: 2018 update. Nucleic Acids Res. 2018;46:W537–W544.</w:t>
       </w:r>
     </w:p>
     <w:p>
@@ -9490,7 +9452,7 @@
           <w:i w:val="0"/>
           <w:sz w:val="20"/>
         </w:rPr>
-        <w:t>10. Afgan E, et al. The Galaxy platform for accessible, reproducible and collaborative biomedical analyses: 2018 update. Nucleic Acids Res. 2018;46:W537–W544.</w:t>
+        <w:t>10. Borrel A, et al. StopTox: an in silico alternative to animal acute systemic toxicity tests. Environ Health Perspect. 2022;130:027014.</w:t>
       </w:r>
     </w:p>
     <w:p>
@@ -9505,7 +9467,7 @@
           <w:i w:val="0"/>
           <w:sz w:val="20"/>
         </w:rPr>
-        <w:t>11. Borrel A, et al. StopTox: an in silico alternative to animal acute systemic toxicity tests. Environ Health Perspect. 2022;130:027014.</w:t>
+        <w:t>11. Borrel A, et al. High-throughput screening to predict chemical-assay interference. Sci Rep. 2020;10:3986.</w:t>
       </w:r>
     </w:p>
     <w:p>
@@ -9520,7 +9482,7 @@
           <w:i w:val="0"/>
           <w:sz w:val="20"/>
         </w:rPr>
-        <w:t>12. Borrel A, et al. High-throughput screening to predict chemical-assay interference. Sci Rep. 2020;10:3986.</w:t>
+        <w:t>12. Banerjee P, Dehnbostel FO, Preissner R. ProTox-3.0: a webserver for the prediction of toxicity of chemicals. Nucleic Acids Res. 2024;52:W513–W520.</w:t>
       </w:r>
     </w:p>
     <w:p>
@@ -9535,7 +9497,7 @@
           <w:i w:val="0"/>
           <w:sz w:val="20"/>
         </w:rPr>
-        <w:t>13. Banerjee P, Dehnbostel FO, Preissner R. ProTox-3.0: a webserver for the prediction of toxicity of chemicals. Nucleic Acids Res. 2024;52:W513–W520.</w:t>
+        <w:t>13. Ertl P, Bienfait B. JSME: a free molecule editor in JavaScript. J Cheminform. 2013;5:24.</w:t>
       </w:r>
     </w:p>
     <w:p>
@@ -9550,7 +9512,7 @@
           <w:i w:val="0"/>
           <w:sz w:val="20"/>
         </w:rPr>
-        <w:t>14. Ertl P, Bienfait B. JSME: a free molecule editor in JavaScript. J Cheminform. 2013;5:24.</w:t>
+        <w:t>14. Veber DF, et al. Molecular properties that influence the oral bioavailability of drug candidates. J Med Chem. 2002;45:2615–2623.</w:t>
       </w:r>
     </w:p>
     <w:p>
@@ -9565,7 +9527,7 @@
           <w:i w:val="0"/>
           <w:sz w:val="20"/>
         </w:rPr>
-        <w:t>15. Veber DF, et al. Molecular properties that influence the oral bioavailability of drug candidates. J Med Chem. 2002;45:2615–2623.</w:t>
+        <w:t>15. Lipinski CA, et al. Experimental and computational approaches to estimate solubility and permeability in drug discovery. Adv Drug Deliv Rev. 2001;46:3–26.</w:t>
       </w:r>
     </w:p>
     <w:p>
@@ -9580,7 +9542,7 @@
           <w:i w:val="0"/>
           <w:sz w:val="20"/>
         </w:rPr>
-        <w:t>16. Lipinski CA, et al. Experimental and computational approaches to estimate solubility and permeability in drug discovery. Adv Drug Deliv Rev. 2001;46:3–26.</w:t>
+        <w:t>16. Meng F, et al. A curated diverse molecular database of blood-brain barrier permeability. Sci Data. 2021;8:289.</w:t>
       </w:r>
     </w:p>
     <w:p>
@@ -9595,7 +9557,7 @@
           <w:i w:val="0"/>
           <w:sz w:val="20"/>
         </w:rPr>
-        <w:t>17. Meng F, et al. A curated diverse molecular database of blood-brain barrier permeability. Sci Data. 2021;8:289.</w:t>
+        <w:t>17. Mansouri K, et al. OPERA models for predicting physicochemical properties and environmental fate endpoints. J Cheminform. 2018;10:10.</w:t>
       </w:r>
     </w:p>
     <w:p>
@@ -9610,7 +9572,7 @@
           <w:i w:val="0"/>
           <w:sz w:val="20"/>
         </w:rPr>
-        <w:t>18. Mansouri K, et al. OPERA models for predicting physicochemical properties and environmental fate endpoints. J Cheminform. 2018;10:10.</w:t>
+        <w:t>18. Tice RR, et al. Improving the human hazard characterization of chemicals: a Tox21 update. Environ Health Perspect. 2013;121:756–765.</w:t>
       </w:r>
     </w:p>
     <w:p>
@@ -9625,7 +9587,7 @@
           <w:i w:val="0"/>
           <w:sz w:val="20"/>
         </w:rPr>
-        <w:t>19. Tice RR, et al. Improving the human hazard characterization of chemicals: a Tox21 update. Environ Health Perspect. 2013;121:756–765.</w:t>
+        <w:t>19. Baell JB, Holloway GA. New substructure filters for removal of pan assay interference compounds (PAINS). J Med Chem. 2010;53:2719–2740.</w:t>
       </w:r>
     </w:p>
     <w:p>
@@ -9640,7 +9602,7 @@
           <w:i w:val="0"/>
           <w:sz w:val="20"/>
         </w:rPr>
-        <w:t>20. Baell JB, Holloway GA. New substructure filters for removal of pan assay interference compounds (PAINS). J Med Chem. 2010;53:2719–2740.</w:t>
+        <w:t>20. Bickerton GR, et al. Quantifying the chemical beauty of drugs. Nat Chem. 2012;4:90–98.</w:t>
       </w:r>
     </w:p>
     <w:p>
@@ -9655,7 +9617,7 @@
           <w:i w:val="0"/>
           <w:sz w:val="20"/>
         </w:rPr>
-        <w:t>21. Bickerton GR, et al. Quantifying the chemical beauty of drugs. Nat Chem. 2012;4:90–98.</w:t>
+        <w:t>21. Delaney JS. ESOL: estimating aqueous solubility directly from molecular structure. J Chem Inf Comput Sci. 2004;44:1000–1005.</w:t>
       </w:r>
     </w:p>
     <w:p>
@@ -9670,7 +9632,7 @@
           <w:i w:val="0"/>
           <w:sz w:val="20"/>
         </w:rPr>
-        <w:t>22. Delaney JS. ESOL: estimating aqueous solubility directly from molecular structure. J Chem Inf Comput Sci. 2004;44:1000–1005.</w:t>
+        <w:t>22. Mansouri K, et al. OPERA models for predicting physicochemical properties. J Cheminform. 2018;10:10.</w:t>
       </w:r>
     </w:p>
     <w:p>
@@ -9685,7 +9647,7 @@
           <w:i w:val="0"/>
           <w:sz w:val="20"/>
         </w:rPr>
-        <w:t>23. Mansouri K, et al. OPERA models for predicting physicochemical properties. J Cheminform. 2018;10:10.</w:t>
+        <w:t>23. Muratov EN, et al. QSAR without borders. Chem Soc Rev. 2020;49:3525–3564.</w:t>
       </w:r>
     </w:p>
     <w:p>
@@ -9700,7 +9662,7 @@
           <w:i w:val="0"/>
           <w:sz w:val="20"/>
         </w:rPr>
-        <w:t>24. Muratov EN, et al. QSAR without borders. Chem Soc Rev. 2020;49:3525–3564.</w:t>
+        <w:t>24. Riniker S, Landrum GA. Better informed distance geometry: using what we know to improve conformation generation. J Chem Inf Model. 2015;55:2562–2574.</w:t>
       </w:r>
     </w:p>
     <w:p>
@@ -9715,7 +9677,7 @@
           <w:i w:val="0"/>
           <w:sz w:val="20"/>
         </w:rPr>
-        <w:t>25. Riniker S, Landrum GA. Better informed distance geometry: using what we know to improve conformation generation. J Chem Inf Model. 2015;55:2562–2574.</w:t>
+        <w:t>25. Eberhardt J, et al. AutoDock Vina 1.2.0. J Chem Inf Model. 2021;61:3891–3898.</w:t>
       </w:r>
     </w:p>
     <w:p>
@@ -9730,7 +9692,7 @@
           <w:i w:val="0"/>
           <w:sz w:val="20"/>
         </w:rPr>
-        <w:t>26. Eberhardt J, et al. AutoDock Vina 1.2.0. J Chem Inf Model. 2021;61:3891–3898.</w:t>
+        <w:t>26. Su M, et al. Comparative assessment of scoring functions: the CASF-2016 benchmark. J Chem Inf Model. 2019;59:895–913.</w:t>
       </w:r>
     </w:p>
     <w:p>
@@ -9745,7 +9707,7 @@
           <w:i w:val="0"/>
           <w:sz w:val="20"/>
         </w:rPr>
-        <w:t>27. Su M, et al. Comparative assessment of scoring functions: the CASF-2016 benchmark. J Chem Inf Model. 2019;59:895–913.</w:t>
+        <w:t>27. Meng F, et al. B3DB: a multitasking dataset for blood-brain barrier permeability. Sci Data. 2021;8:289.</w:t>
       </w:r>
     </w:p>
     <w:p>
@@ -9760,7 +9722,7 @@
           <w:i w:val="0"/>
           <w:sz w:val="20"/>
         </w:rPr>
-        <w:t>28. Meng F, et al. B3DB: a multitasking dataset for blood-brain barrier permeability. Sci Data. 2021;8:289.</w:t>
+        <w:t>28. Sander T, et al. DataWarrior: an open-source program for chemistry aware data visualization. J Chem Inf Model. 2015;55:460–473.</w:t>
       </w:r>
     </w:p>
     <w:p>
@@ -9775,7 +9737,7 @@
           <w:i w:val="0"/>
           <w:sz w:val="20"/>
         </w:rPr>
-        <w:t>29. Sander T, et al. DataWarrior: an open-source program for chemistry aware data visualization. J Chem Inf Model. 2015;55:460–473.</w:t>
+        <w:t>29. Dhanjal JK, et al. GraphB3: an explainable GCN approach for BBB permeability prediction. J Cheminform. 2024;16:34.</w:t>
       </w:r>
     </w:p>
     <w:p>
@@ -9790,22 +9752,7 @@
           <w:i w:val="0"/>
           <w:sz w:val="20"/>
         </w:rPr>
-        <w:t>30. Dhanjal JK, et al. GraphB3: an explainable GCN approach for BBB permeability prediction. J Cheminform. 2024;16:34.</w:t>
-      </w:r>
-    </w:p>
-    <w:p>
-      <w:pPr>
-        <w:spacing w:before="0" w:after="60"/>
-        <w:jc w:val="left"/>
-      </w:pPr>
-      <w:r>
-        <w:rPr>
-          <w:rFonts w:ascii="Times New Roman" w:hAnsi="Times New Roman"/>
-          <w:b w:val="0"/>
-          <w:i w:val="0"/>
-          <w:sz w:val="20"/>
-        </w:rPr>
-        <w:t>31. Hierro-Bujalance C, et al. Empagliflozin reduces vascular damage and cognitive impairment in a mixed murine model of Alzheimer's disease and type 2 diabetes. Alzheimers Res Ther. 2020;12:40.</w:t>
+        <w:t>30. Hierro-Bujalance C, et al. Empagliflozin reduces vascular damage and cognitive impairment in a mixed murine model of Alzheimer's disease and type 2 diabetes. Alzheimers Res Ther. 2020;12:40.</w:t>
       </w:r>
     </w:p>
     <w:p>

</xml_diff>